<commit_message>
Tighten the Siemens Energy USP to what the field asks for
The field says bullet points and says keep it short, so six long bullets were
the wrong answer to it - length in that box reads as padding. Five bullets,
about 150 words, with a three-bullet version for a tight field.

The claims are held to what the rest of the form says. No certification,
because none is held. No price, no named client, scheme or former employer,
and no turnover or headcount figure the financial fields would contradict.
Nothing implies a duty holder appointment under CDM 2015. And the
accommodation experience is written as the director's capability rather than
a company track record, because the business-experience answer says 1 to 3
years and the two have to agree.

Co-Authored-By: Claude Opus 5 <noreply@anthropic.com>
Claude-Session: https://claude.ai/code/session_01FSMGWiuyxiwEg6xP82Agwr
</commit_message>
<xml_diff>
--- a/business/bids/ETABLIX-siemens-energy-supplier-form.docx
+++ b/business/bids/ETABLIX-siemens-energy-supplier-form.docx
@@ -4207,7 +4207,7 @@
           <w:sz w:val="20"/>
           <w:szCs w:val="20"/>
         </w:rPr>
-        <w:t xml:space="preserve">They ask for bullet points and ask for it short. This is the only field on the form that sells, and a long answer in it is read as padding.</w:t>
+        <w:t xml:space="preserve">They ask for bullet points and they ask for it short. This is the only field on the form that sells, and length in it is read as padding. Five bullets, about 150 words. Paste as a bulleted list — the field takes formatting.</w:t>
       </w:r>
     </w:p>
     <w:p>
@@ -4222,22 +4222,11 @@
       <w:r>
         <w:rPr>
           <w:rFonts w:ascii="Arial" w:cs="Arial" w:eastAsia="Arial" w:hAnsi="Arial"/>
-          <w:b/>
-          <w:bCs/>
-          <w:color w:val="14181D"/>
-          <w:sz w:val="20"/>
-          <w:szCs w:val="20"/>
-        </w:rPr>
-        <w:t xml:space="preserve">One accountable interface for the whole temporary site system</w:t>
-      </w:r>
-      <w:r>
-        <w:rPr>
-          <w:rFonts w:ascii="Arial" w:cs="Arial" w:eastAsia="Arial" w:hAnsi="Arial"/>
-          <w:color w:val="14181D"/>
-          <w:sz w:val="20"/>
-          <w:szCs w:val="20"/>
-        </w:rPr>
-        <w:t xml:space="preserve"> —</w:t>
+          <w:color w:val="14181D"/>
+          <w:sz w:val="20"/>
+          <w:szCs w:val="20"/>
+        </w:rPr>
+        <w:t xml:space="preserve">One accountable interface for the whole temporary site system — compound</w:t>
       </w:r>
     </w:p>
     <w:p>
@@ -4256,7 +4245,7 @@
           <w:sz w:val="19"/>
           <w:szCs w:val="19"/>
         </w:rPr>
-        <w:t xml:space="preserve">compound and welfare, temporary power and utilities, security, waste, catering, workforce accommodation, logistics, demobilisation and reinstatement — instead of ten to twenty-five separate packages, each with its own interface for the project team to manage.</w:t>
+        <w:t xml:space="preserve">and welfare, temporary power and utilities, security, waste, catering, workforce accommodation, logistics, demobilisation and reinstatement — instead of 10 to 25 separate packages for your project team to manage.</w:t>
       </w:r>
     </w:p>
     <w:p>
@@ -4271,22 +4260,11 @@
       <w:r>
         <w:rPr>
           <w:rFonts w:ascii="Arial" w:cs="Arial" w:eastAsia="Arial" w:hAnsi="Arial"/>
-          <w:b/>
-          <w:bCs/>
-          <w:color w:val="14181D"/>
-          <w:sz w:val="20"/>
-          <w:szCs w:val="20"/>
-        </w:rPr>
-        <w:t xml:space="preserve">The interfaces are the scope.</w:t>
-      </w:r>
-      <w:r>
-        <w:rPr>
-          <w:rFonts w:ascii="Arial" w:cs="Arial" w:eastAsia="Arial" w:hAnsi="Arial"/>
-          <w:color w:val="14181D"/>
-          <w:sz w:val="20"/>
-          <w:szCs w:val="20"/>
-        </w:rPr>
-        <w:t xml:space="preserve"> The generator sized without the welfare</w:t>
+          <w:color w:val="14181D"/>
+          <w:sz w:val="20"/>
+          <w:szCs w:val="20"/>
+        </w:rPr>
+        <w:t xml:space="preserve">We own the interfaces between those suppliers, which is where cost and</w:t>
       </w:r>
     </w:p>
     <w:p>
@@ -4305,7 +4283,7 @@
           <w:sz w:val="19"/>
           <w:szCs w:val="19"/>
         </w:rPr>
-        <w:t xml:space="preserve">load, the accommodation opening after the workforce arrives, three suppliers invoicing the same standby labour: these are not supplier failures, they are gaps between suppliers that nobody owns. We own them.</w:t>
+        <w:t xml:space="preserve">programme actually leak: the generator sized without the welfare load, accommodation opening after the workforce arrives, three suppliers invoicing the same standby labour.</w:t>
       </w:r>
     </w:p>
     <w:p>
@@ -4320,22 +4298,11 @@
       <w:r>
         <w:rPr>
           <w:rFonts w:ascii="Arial" w:cs="Arial" w:eastAsia="Arial" w:hAnsi="Arial"/>
-          <w:b/>
-          <w:bCs/>
-          <w:color w:val="14181D"/>
-          <w:sz w:val="20"/>
-          <w:szCs w:val="20"/>
-        </w:rPr>
-        <w:t xml:space="preserve">Three ways to engage, so the risk sits where it belongs.</w:t>
-      </w:r>
-      <w:r>
-        <w:rPr>
-          <w:rFonts w:ascii="Arial" w:cs="Arial" w:eastAsia="Arial" w:hAnsi="Arial"/>
-          <w:color w:val="14181D"/>
-          <w:sz w:val="20"/>
-          <w:szCs w:val="20"/>
-        </w:rPr>
-        <w:t xml:space="preserve"> Advisory — we</w:t>
+          <w:color w:val="14181D"/>
+          <w:sz w:val="20"/>
+          <w:szCs w:val="20"/>
+        </w:rPr>
+        <w:t xml:space="preserve">Three engagement models, so the risk sits where you want it. Advisory — we</w:t>
       </w:r>
     </w:p>
     <w:p>
@@ -4354,7 +4321,7 @@
           <w:sz w:val="19"/>
           <w:szCs w:val="19"/>
         </w:rPr>
-        <w:t xml:space="preserve">specify and you contract. Management Integrator — you contract every supplier directly and we control delivery; we never hold your supply-chain money. Prime Service Contractor — one contract for the whole temporary scope.</w:t>
+        <w:t xml:space="preserve">specify, you contract. Management Integrator — you contract every supplier directly, we control delivery, and we never hold your supply-chain money. Prime Service Contractor — one contract for the whole temporary scope.</w:t>
       </w:r>
     </w:p>
     <w:p>
@@ -4369,22 +4336,11 @@
       <w:r>
         <w:rPr>
           <w:rFonts w:ascii="Arial" w:cs="Arial" w:eastAsia="Arial" w:hAnsi="Arial"/>
-          <w:b/>
-          <w:bCs/>
-          <w:color w:val="14181D"/>
-          <w:sz w:val="20"/>
-          <w:szCs w:val="20"/>
-        </w:rPr>
-        <w:t xml:space="preserve">Priced and programmed before mobilisation, not during it.</w:t>
-      </w:r>
-      <w:r>
-        <w:rPr>
-          <w:rFonts w:ascii="Arial" w:cs="Arial" w:eastAsia="Arial" w:hAnsi="Arial"/>
-          <w:color w:val="14181D"/>
-          <w:sz w:val="20"/>
-          <w:szCs w:val="20"/>
-        </w:rPr>
-        <w:t xml:space="preserve"> Site</w:t>
+          <w:color w:val="14181D"/>
+          <w:sz w:val="20"/>
+          <w:szCs w:val="20"/>
+        </w:rPr>
+        <w:t xml:space="preserve">Priced and programmed before mobilisation rather than during it: a number,</w:t>
       </w:r>
     </w:p>
     <w:p>
@@ -4403,7 +4359,7 @@
           <w:sz w:val="19"/>
           <w:szCs w:val="19"/>
         </w:rPr>
-        <w:t xml:space="preserve">establishment is settled in the fortnight before anyone is watching and paid for across the whole programme; we put a number, an owner and an acceptance test against every line of it first.</w:t>
+        <w:t xml:space="preserve">an owner and an acceptance test against every line of it.</w:t>
       </w:r>
     </w:p>
     <w:p>
@@ -4418,22 +4374,11 @@
       <w:r>
         <w:rPr>
           <w:rFonts w:ascii="Arial" w:cs="Arial" w:eastAsia="Arial" w:hAnsi="Arial"/>
-          <w:b/>
-          <w:bCs/>
-          <w:color w:val="14181D"/>
-          <w:sz w:val="20"/>
-          <w:szCs w:val="20"/>
-        </w:rPr>
-        <w:t xml:space="preserve">Led by a chartered construction professional</w:t>
-      </w:r>
-      <w:r>
-        <w:rPr>
-          <w:rFonts w:ascii="Arial" w:cs="Arial" w:eastAsia="Arial" w:hAnsi="Arial"/>
-          <w:color w:val="14181D"/>
-          <w:sz w:val="20"/>
-          <w:szCs w:val="20"/>
-        </w:rPr>
-        <w:t xml:space="preserve"> (MCIOB) with delivery</w:t>
+          <w:color w:val="14181D"/>
+          <w:sz w:val="20"/>
+          <w:szCs w:val="20"/>
+        </w:rPr>
+        <w:t xml:space="preserve">Chartered construction leadership (MCIOB) across electricity transmission,</w:t>
       </w:r>
     </w:p>
     <w:p>
@@ -4452,7 +4397,25 @@
           <w:sz w:val="19"/>
           <w:szCs w:val="19"/>
         </w:rPr>
-        <w:t xml:space="preserve">experience across transmission, energy and major infrastructure, including workforce accommodation villages scoped at several hundred beds and multi-year duration.</w:t>
+        <w:t xml:space="preserve">energy and major infrastructure, including workforce accommodation villages scoped at several hundred beds over multi-year programmes — reported through our own project-control platform.</w:t>
+      </w:r>
+    </w:p>
+    <w:p>
+      <w:pPr>
+        <w:pStyle w:val="Heading2"/>
+        <w:keepNext/>
+        <w:spacing w:after="110" w:before="260"/>
+      </w:pPr>
+      <w:r>
+        <w:rPr>
+          <w:rFonts w:ascii="Arial" w:cs="Arial" w:eastAsia="Arial" w:hAnsi="Arial"/>
+          <w:b/>
+          <w:bCs/>
+          <w:color w:val="9C7A3C"/>
+          <w:sz w:val="21"/>
+          <w:szCs w:val="21"/>
+        </w:rPr>
+        <w:t xml:space="preserve">A shorter three-bullet version, if the field is tight</w:t>
       </w:r>
     </w:p>
     <w:p>
@@ -4467,22 +4430,11 @@
       <w:r>
         <w:rPr>
           <w:rFonts w:ascii="Arial" w:cs="Arial" w:eastAsia="Arial" w:hAnsi="Arial"/>
-          <w:b/>
-          <w:bCs/>
-          <w:color w:val="14181D"/>
-          <w:sz w:val="20"/>
-          <w:szCs w:val="20"/>
-        </w:rPr>
-        <w:t xml:space="preserve">Our own project-control platform</w:t>
-      </w:r>
-      <w:r>
-        <w:rPr>
-          <w:rFonts w:ascii="Arial" w:cs="Arial" w:eastAsia="Arial" w:hAnsi="Arial"/>
-          <w:color w:val="14181D"/>
-          <w:sz w:val="20"/>
-          <w:szCs w:val="20"/>
-        </w:rPr>
-        <w:t xml:space="preserve">, CONSTRUX, so programme, cost, change,</w:t>
+          <w:color w:val="14181D"/>
+          <w:sz w:val="20"/>
+          <w:szCs w:val="20"/>
+        </w:rPr>
+        <w:t xml:space="preserve">One accountable interface for the whole temporary site system — welfare,</w:t>
       </w:r>
     </w:p>
     <w:p>
@@ -4501,7 +4453,115 @@
           <w:sz w:val="19"/>
           <w:szCs w:val="19"/>
         </w:rPr>
-        <w:t xml:space="preserve">evidence and supplier performance are reported from one record rather than reassembled each month.</w:t>
+        <w:t xml:space="preserve">power, security, waste, catering, workforce accommodation, logistics and reinstatement — instead of 10 to 25 packages your team manages separately.</w:t>
+      </w:r>
+    </w:p>
+    <w:p>
+      <w:pPr>
+        <w:pStyle w:val="ListParagraph"/>
+        <w:numPr>
+          <w:ilvl w:val="0"/>
+          <w:numId w:val="2"/>
+        </w:numPr>
+        <w:spacing w:after="50" w:before="50" w:line="280"/>
+      </w:pPr>
+      <w:r>
+        <w:rPr>
+          <w:rFonts w:ascii="Arial" w:cs="Arial" w:eastAsia="Arial" w:hAnsi="Arial"/>
+          <w:color w:val="14181D"/>
+          <w:sz w:val="20"/>
+          <w:szCs w:val="20"/>
+        </w:rPr>
+        <w:t xml:space="preserve">We own the interfaces between them, which is where cost and programme leak.</w:t>
+      </w:r>
+    </w:p>
+    <w:p>
+      <w:pPr>
+        <w:pBdr>
+          <w:left w:val="single" w:color="9C7A3C" w:sz="18" w:space="10"/>
+        </w:pBdr>
+        <w:shd w:fill="EFE6D2" w:color="auto" w:val="clear"/>
+        <w:spacing w:after="150" w:before="150" w:line="280"/>
+        <w:ind w:left="170" w:right="170"/>
+      </w:pPr>
+      <w:r>
+        <w:rPr>
+          <w:rFonts w:ascii="Arial" w:cs="Arial" w:eastAsia="Arial" w:hAnsi="Arial"/>
+          <w:color w:val="14181D"/>
+          <w:sz w:val="19"/>
+          <w:szCs w:val="19"/>
+        </w:rPr>
+        <w:t xml:space="preserve">Three engagement models, from advisory to a single contract for the whole temporary scope; in the middle model we never hold your supply-chain money.</w:t>
+      </w:r>
+    </w:p>
+    <w:p>
+      <w:pPr>
+        <w:pStyle w:val="ListParagraph"/>
+        <w:numPr>
+          <w:ilvl w:val="0"/>
+          <w:numId w:val="2"/>
+        </w:numPr>
+        <w:spacing w:after="50" w:before="50" w:line="280"/>
+      </w:pPr>
+      <w:r>
+        <w:rPr>
+          <w:rFonts w:ascii="Arial" w:cs="Arial" w:eastAsia="Arial" w:hAnsi="Arial"/>
+          <w:color w:val="14181D"/>
+          <w:sz w:val="20"/>
+          <w:szCs w:val="20"/>
+        </w:rPr>
+        <w:t xml:space="preserve">Chartered construction leadership (MCIOB) across transmission, energy and</w:t>
+      </w:r>
+    </w:p>
+    <w:p>
+      <w:pPr>
+        <w:pBdr>
+          <w:left w:val="single" w:color="9C7A3C" w:sz="18" w:space="10"/>
+        </w:pBdr>
+        <w:shd w:fill="EFE6D2" w:color="auto" w:val="clear"/>
+        <w:spacing w:after="150" w:before="150" w:line="280"/>
+        <w:ind w:left="170" w:right="170"/>
+      </w:pPr>
+      <w:r>
+        <w:rPr>
+          <w:rFonts w:ascii="Arial" w:cs="Arial" w:eastAsia="Arial" w:hAnsi="Arial"/>
+          <w:color w:val="14181D"/>
+          <w:sz w:val="19"/>
+          <w:szCs w:val="19"/>
+        </w:rPr>
+        <w:t xml:space="preserve">major infrastructure, including workforce accommodation villages of several hundred beds, priced and programmed before mobilisation rather than during it.</w:t>
+      </w:r>
+    </w:p>
+    <w:p>
+      <w:pPr>
+        <w:pStyle w:val="Heading2"/>
+        <w:keepNext/>
+        <w:spacing w:after="110" w:before="260"/>
+      </w:pPr>
+      <w:r>
+        <w:rPr>
+          <w:rFonts w:ascii="Arial" w:cs="Arial" w:eastAsia="Arial" w:hAnsi="Arial"/>
+          <w:b/>
+          <w:bCs/>
+          <w:color w:val="9C7A3C"/>
+          <w:sz w:val="21"/>
+          <w:szCs w:val="21"/>
+        </w:rPr>
+        <w:t xml:space="preserve">What these bullets deliberately avoid</w:t>
+      </w:r>
+    </w:p>
+    <w:p>
+      <w:pPr>
+        <w:spacing w:after="90" w:before="90" w:line="280"/>
+      </w:pPr>
+      <w:r>
+        <w:rPr>
+          <w:rFonts w:ascii="Arial" w:cs="Arial" w:eastAsia="Arial" w:hAnsi="Arial"/>
+          <w:color w:val="14181D"/>
+          <w:sz w:val="20"/>
+          <w:szCs w:val="20"/>
+        </w:rPr>
+        <w:t xml:space="preserve">No certification is claimed, because none is held. No price, and no named client, scheme or former employer. No turnover, headcount or growth figure that the financial fields would contradict. Nothing implies a Principal Contractor or Principal Designer appointment under CDM 2015 — the scope is described as supply and control, not as a statutory duty holder. The accommodation experience is the director's and is written as capability rather than as a company track record, because the business-experience field already says 1 to 3 years and the two answers have to agree.</w:t>
       </w:r>
     </w:p>
     <w:p>

</xml_diff>